<commit_message>
docs: record the Oct 24-25 re-test (all 10 Pass, APK v1.0.1); issues #39 to #44 closed
</commit_message>
<xml_diff>
--- a/docs/RoadWatch-Retest-v1.0.1.docx
+++ b/docs/RoadWatch-Retest-v1.0.1.docx
@@ -9,6 +9,29 @@
       </w:pPr>
       <w:r>
         <w:t xml:space="preserve">RoadWatch re-test after the Oct 23 fixes (v1.0.1)</w:t>
+      </w:r>
+    </w:p>
+    <w:p>
+      <w:pPr>
+        <w:spacing w:after="160"/>
+      </w:pPr>
+      <w:r>
+        <w:rPr>
+          <w:rFonts w:ascii="Calibri" w:cs="Calibri" w:eastAsia="Calibri" w:hAnsi="Calibri"/>
+          <w:b/>
+          <w:bCs/>
+          <w:sz w:val="22"/>
+          <w:szCs w:val="22"/>
+        </w:rPr>
+        <w:t xml:space="preserve">Result (Oct 24-25, Pauline, APK v1.0.1): all 10 re-tests Pass;</w:t>
+      </w:r>
+      <w:r>
+        <w:rPr>
+          <w:rFonts w:ascii="Calibri" w:cs="Calibri" w:eastAsia="Calibri" w:hAnsi="Calibri"/>
+          <w:sz w:val="22"/>
+          <w:szCs w:val="22"/>
+        </w:rPr>
+        <w:t xml:space="preserve"> issues #39 to #44 closed on Oct 25.</w:t>
       </w:r>
     </w:p>
     <w:p>
@@ -1148,6 +1171,14 @@
               <w:keepNext/>
               <w:spacing w:after="0" w:before="0"/>
             </w:pPr>
+            <w:r>
+              <w:rPr>
+                <w:rFonts w:ascii="Calibri" w:cs="Calibri" w:eastAsia="Calibri" w:hAnsi="Calibri"/>
+                <w:sz w:val="20"/>
+                <w:szCs w:val="20"/>
+              </w:rPr>
+              <w:t xml:space="preserve">As expected (Oct 25, Pauline)</w:t>
+            </w:r>
           </w:p>
         </w:tc>
         <w:tc>
@@ -1172,6 +1203,14 @@
               <w:keepNext/>
               <w:spacing w:after="0" w:before="0"/>
             </w:pPr>
+            <w:r>
+              <w:rPr>
+                <w:rFonts w:ascii="Calibri" w:cs="Calibri" w:eastAsia="Calibri" w:hAnsi="Calibri"/>
+                <w:sz w:val="20"/>
+                <w:szCs w:val="20"/>
+              </w:rPr>
+              <w:t xml:space="preserve">Pass</w:t>
+            </w:r>
           </w:p>
         </w:tc>
       </w:tr>
@@ -1412,6 +1451,14 @@
               <w:keepNext/>
               <w:spacing w:after="0" w:before="0"/>
             </w:pPr>
+            <w:r>
+              <w:rPr>
+                <w:rFonts w:ascii="Calibri" w:cs="Calibri" w:eastAsia="Calibri" w:hAnsi="Calibri"/>
+                <w:sz w:val="20"/>
+                <w:szCs w:val="20"/>
+              </w:rPr>
+              <w:t xml:space="preserve">As expected (Oct 25, Pauline)</w:t>
+            </w:r>
           </w:p>
         </w:tc>
         <w:tc>
@@ -1436,6 +1483,14 @@
               <w:keepNext/>
               <w:spacing w:after="0" w:before="0"/>
             </w:pPr>
+            <w:r>
+              <w:rPr>
+                <w:rFonts w:ascii="Calibri" w:cs="Calibri" w:eastAsia="Calibri" w:hAnsi="Calibri"/>
+                <w:sz w:val="20"/>
+                <w:szCs w:val="20"/>
+              </w:rPr>
+              <w:t xml:space="preserve">Pass</w:t>
+            </w:r>
           </w:p>
         </w:tc>
       </w:tr>
@@ -1644,6 +1699,14 @@
               <w:keepNext/>
               <w:spacing w:after="0" w:before="0"/>
             </w:pPr>
+            <w:r>
+              <w:rPr>
+                <w:rFonts w:ascii="Calibri" w:cs="Calibri" w:eastAsia="Calibri" w:hAnsi="Calibri"/>
+                <w:sz w:val="20"/>
+                <w:szCs w:val="20"/>
+              </w:rPr>
+              <w:t xml:space="preserve">As expected (Oct 25, Pauline)</w:t>
+            </w:r>
           </w:p>
         </w:tc>
         <w:tc>
@@ -1668,6 +1731,14 @@
               <w:keepNext/>
               <w:spacing w:after="0" w:before="0"/>
             </w:pPr>
+            <w:r>
+              <w:rPr>
+                <w:rFonts w:ascii="Calibri" w:cs="Calibri" w:eastAsia="Calibri" w:hAnsi="Calibri"/>
+                <w:sz w:val="20"/>
+                <w:szCs w:val="20"/>
+              </w:rPr>
+              <w:t xml:space="preserve">Pass</w:t>
+            </w:r>
           </w:p>
         </w:tc>
       </w:tr>
@@ -1906,6 +1977,14 @@
               <w:keepNext/>
               <w:spacing w:after="0" w:before="0"/>
             </w:pPr>
+            <w:r>
+              <w:rPr>
+                <w:rFonts w:ascii="Calibri" w:cs="Calibri" w:eastAsia="Calibri" w:hAnsi="Calibri"/>
+                <w:sz w:val="20"/>
+                <w:szCs w:val="20"/>
+              </w:rPr>
+              <w:t xml:space="preserve">As expected (Oct 25, Pauline)</w:t>
+            </w:r>
           </w:p>
         </w:tc>
         <w:tc>
@@ -1930,6 +2009,14 @@
               <w:keepNext/>
               <w:spacing w:after="0" w:before="0"/>
             </w:pPr>
+            <w:r>
+              <w:rPr>
+                <w:rFonts w:ascii="Calibri" w:cs="Calibri" w:eastAsia="Calibri" w:hAnsi="Calibri"/>
+                <w:sz w:val="20"/>
+                <w:szCs w:val="20"/>
+              </w:rPr>
+              <w:t xml:space="preserve">Pass</w:t>
+            </w:r>
           </w:p>
         </w:tc>
       </w:tr>
@@ -2120,6 +2207,14 @@
               <w:keepNext/>
               <w:spacing w:after="0" w:before="0"/>
             </w:pPr>
+            <w:r>
+              <w:rPr>
+                <w:rFonts w:ascii="Calibri" w:cs="Calibri" w:eastAsia="Calibri" w:hAnsi="Calibri"/>
+                <w:sz w:val="20"/>
+                <w:szCs w:val="20"/>
+              </w:rPr>
+              <w:t xml:space="preserve">As expected (Oct 25, Pauline)</w:t>
+            </w:r>
           </w:p>
         </w:tc>
         <w:tc>
@@ -2144,6 +2239,14 @@
               <w:keepNext/>
               <w:spacing w:after="0" w:before="0"/>
             </w:pPr>
+            <w:r>
+              <w:rPr>
+                <w:rFonts w:ascii="Calibri" w:cs="Calibri" w:eastAsia="Calibri" w:hAnsi="Calibri"/>
+                <w:sz w:val="20"/>
+                <w:szCs w:val="20"/>
+              </w:rPr>
+              <w:t xml:space="preserve">Pass</w:t>
+            </w:r>
           </w:p>
         </w:tc>
       </w:tr>
@@ -2352,6 +2455,14 @@
               <w:keepNext/>
               <w:spacing w:after="0" w:before="0"/>
             </w:pPr>
+            <w:r>
+              <w:rPr>
+                <w:rFonts w:ascii="Calibri" w:cs="Calibri" w:eastAsia="Calibri" w:hAnsi="Calibri"/>
+                <w:sz w:val="20"/>
+                <w:szCs w:val="20"/>
+              </w:rPr>
+              <w:t xml:space="preserve">As expected (Oct 25, Pauline)</w:t>
+            </w:r>
           </w:p>
         </w:tc>
         <w:tc>
@@ -2376,6 +2487,14 @@
               <w:keepNext/>
               <w:spacing w:after="0" w:before="0"/>
             </w:pPr>
+            <w:r>
+              <w:rPr>
+                <w:rFonts w:ascii="Calibri" w:cs="Calibri" w:eastAsia="Calibri" w:hAnsi="Calibri"/>
+                <w:sz w:val="20"/>
+                <w:szCs w:val="20"/>
+              </w:rPr>
+              <w:t xml:space="preserve">Pass</w:t>
+            </w:r>
           </w:p>
         </w:tc>
       </w:tr>
@@ -2584,6 +2703,14 @@
               <w:keepNext w:val="false"/>
               <w:spacing w:after="0" w:before="0"/>
             </w:pPr>
+            <w:r>
+              <w:rPr>
+                <w:rFonts w:ascii="Calibri" w:cs="Calibri" w:eastAsia="Calibri" w:hAnsi="Calibri"/>
+                <w:sz w:val="20"/>
+                <w:szCs w:val="20"/>
+              </w:rPr>
+              <w:t xml:space="preserve">As expected (Oct 25, Pauline)</w:t>
+            </w:r>
           </w:p>
         </w:tc>
         <w:tc>
@@ -2608,6 +2735,14 @@
               <w:keepNext w:val="false"/>
               <w:spacing w:after="0" w:before="0"/>
             </w:pPr>
+            <w:r>
+              <w:rPr>
+                <w:rFonts w:ascii="Calibri" w:cs="Calibri" w:eastAsia="Calibri" w:hAnsi="Calibri"/>
+                <w:sz w:val="20"/>
+                <w:szCs w:val="20"/>
+              </w:rPr>
+              <w:t xml:space="preserve">Pass</w:t>
+            </w:r>
           </w:p>
         </w:tc>
       </w:tr>
@@ -3128,6 +3263,14 @@
               <w:keepNext/>
               <w:spacing w:after="0" w:before="0"/>
             </w:pPr>
+            <w:r>
+              <w:rPr>
+                <w:rFonts w:ascii="Calibri" w:cs="Calibri" w:eastAsia="Calibri" w:hAnsi="Calibri"/>
+                <w:sz w:val="20"/>
+                <w:szCs w:val="20"/>
+              </w:rPr>
+              <w:t xml:space="preserve">As expected (Oct 25, Pauline)</w:t>
+            </w:r>
           </w:p>
         </w:tc>
         <w:tc>
@@ -3152,6 +3295,14 @@
               <w:keepNext/>
               <w:spacing w:after="0" w:before="0"/>
             </w:pPr>
+            <w:r>
+              <w:rPr>
+                <w:rFonts w:ascii="Calibri" w:cs="Calibri" w:eastAsia="Calibri" w:hAnsi="Calibri"/>
+                <w:sz w:val="20"/>
+                <w:szCs w:val="20"/>
+              </w:rPr>
+              <w:t xml:space="preserve">Pass</w:t>
+            </w:r>
           </w:p>
         </w:tc>
       </w:tr>
@@ -3342,6 +3493,14 @@
               <w:keepNext/>
               <w:spacing w:after="0" w:before="0"/>
             </w:pPr>
+            <w:r>
+              <w:rPr>
+                <w:rFonts w:ascii="Calibri" w:cs="Calibri" w:eastAsia="Calibri" w:hAnsi="Calibri"/>
+                <w:sz w:val="20"/>
+                <w:szCs w:val="20"/>
+              </w:rPr>
+              <w:t xml:space="preserve">As expected (Oct 25, Pauline)</w:t>
+            </w:r>
           </w:p>
         </w:tc>
         <w:tc>
@@ -3366,6 +3525,14 @@
               <w:keepNext/>
               <w:spacing w:after="0" w:before="0"/>
             </w:pPr>
+            <w:r>
+              <w:rPr>
+                <w:rFonts w:ascii="Calibri" w:cs="Calibri" w:eastAsia="Calibri" w:hAnsi="Calibri"/>
+                <w:sz w:val="20"/>
+                <w:szCs w:val="20"/>
+              </w:rPr>
+              <w:t xml:space="preserve">Pass</w:t>
+            </w:r>
           </w:p>
         </w:tc>
       </w:tr>
@@ -3574,6 +3741,14 @@
               <w:keepNext w:val="false"/>
               <w:spacing w:after="0" w:before="0"/>
             </w:pPr>
+            <w:r>
+              <w:rPr>
+                <w:rFonts w:ascii="Calibri" w:cs="Calibri" w:eastAsia="Calibri" w:hAnsi="Calibri"/>
+                <w:sz w:val="20"/>
+                <w:szCs w:val="20"/>
+              </w:rPr>
+              <w:t xml:space="preserve">As expected (Oct 25, Pauline)</w:t>
+            </w:r>
           </w:p>
         </w:tc>
         <w:tc>
@@ -3598,6 +3773,14 @@
               <w:keepNext w:val="false"/>
               <w:spacing w:after="0" w:before="0"/>
             </w:pPr>
+            <w:r>
+              <w:rPr>
+                <w:rFonts w:ascii="Calibri" w:cs="Calibri" w:eastAsia="Calibri" w:hAnsi="Calibri"/>
+                <w:sz w:val="20"/>
+                <w:szCs w:val="20"/>
+              </w:rPr>
+              <w:t xml:space="preserve">Pass</w:t>
+            </w:r>
           </w:p>
         </w:tc>
       </w:tr>
@@ -3975,6 +4158,14 @@
               <w:keepNext/>
               <w:spacing w:after="0" w:before="0"/>
             </w:pPr>
+            <w:r>
+              <w:rPr>
+                <w:rFonts w:ascii="Calibri" w:cs="Calibri" w:eastAsia="Calibri" w:hAnsi="Calibri"/>
+                <w:sz w:val="20"/>
+                <w:szCs w:val="20"/>
+              </w:rPr>
+              <w:t xml:space="preserve">Pass, Oct 25</w:t>
+            </w:r>
           </w:p>
         </w:tc>
       </w:tr>
@@ -4137,6 +4328,14 @@
               <w:keepNext/>
               <w:spacing w:after="0" w:before="0"/>
             </w:pPr>
+            <w:r>
+              <w:rPr>
+                <w:rFonts w:ascii="Calibri" w:cs="Calibri" w:eastAsia="Calibri" w:hAnsi="Calibri"/>
+                <w:sz w:val="20"/>
+                <w:szCs w:val="20"/>
+              </w:rPr>
+              <w:t xml:space="preserve">Pass, Oct 25</w:t>
+            </w:r>
           </w:p>
         </w:tc>
       </w:tr>
@@ -4294,6 +4493,14 @@
               <w:keepNext/>
               <w:spacing w:after="0" w:before="0"/>
             </w:pPr>
+            <w:r>
+              <w:rPr>
+                <w:rFonts w:ascii="Calibri" w:cs="Calibri" w:eastAsia="Calibri" w:hAnsi="Calibri"/>
+                <w:sz w:val="20"/>
+                <w:szCs w:val="20"/>
+              </w:rPr>
+              <w:t xml:space="preserve">Pass, Oct 25</w:t>
+            </w:r>
           </w:p>
         </w:tc>
       </w:tr>
@@ -4456,6 +4663,14 @@
               <w:keepNext/>
               <w:spacing w:after="0" w:before="0"/>
             </w:pPr>
+            <w:r>
+              <w:rPr>
+                <w:rFonts w:ascii="Calibri" w:cs="Calibri" w:eastAsia="Calibri" w:hAnsi="Calibri"/>
+                <w:sz w:val="20"/>
+                <w:szCs w:val="20"/>
+              </w:rPr>
+              <w:t xml:space="preserve">Pass, Oct 25</w:t>
+            </w:r>
           </w:p>
         </w:tc>
       </w:tr>
@@ -4613,6 +4828,14 @@
               <w:keepNext/>
               <w:spacing w:after="0" w:before="0"/>
             </w:pPr>
+            <w:r>
+              <w:rPr>
+                <w:rFonts w:ascii="Calibri" w:cs="Calibri" w:eastAsia="Calibri" w:hAnsi="Calibri"/>
+                <w:sz w:val="20"/>
+                <w:szCs w:val="20"/>
+              </w:rPr>
+              <w:t xml:space="preserve">Pass, Oct 25</w:t>
+            </w:r>
           </w:p>
         </w:tc>
       </w:tr>
@@ -4775,6 +4998,14 @@
               <w:keepNext/>
               <w:spacing w:after="0" w:before="0"/>
             </w:pPr>
+            <w:r>
+              <w:rPr>
+                <w:rFonts w:ascii="Calibri" w:cs="Calibri" w:eastAsia="Calibri" w:hAnsi="Calibri"/>
+                <w:sz w:val="20"/>
+                <w:szCs w:val="20"/>
+              </w:rPr>
+              <w:t xml:space="preserve">Pass, Oct 25</w:t>
+            </w:r>
           </w:p>
         </w:tc>
       </w:tr>

</xml_diff>

<commit_message>
docs: re-test Actual notes; first-run gaps closed (TC-08.7, 09.3, 03.3, 06.1, 06.2)
</commit_message>
<xml_diff>
--- a/docs/RoadWatch-Retest-v1.0.1.docx
+++ b/docs/RoadWatch-Retest-v1.0.1.docx
@@ -1177,7 +1177,7 @@
                 <w:sz w:val="20"/>
                 <w:szCs w:val="20"/>
               </w:rPr>
-              <w:t xml:space="preserve">As expected (Oct 25, Pauline)</w:t>
+              <w:t xml:space="preserve">Wrong current password: "Your current password is incorrect." under Current password, no "Validation failed" box. Right password: "Password changed."; Action log lists it. A1's password is now changed (Oct 24-25)</w:t>
             </w:r>
           </w:p>
         </w:tc>
@@ -1457,7 +1457,23 @@
                 <w:sz w:val="20"/>
                 <w:szCs w:val="20"/>
               </w:rPr>
-              <w:t xml:space="preserve">As expected (Oct 25, Pauline)</w:t>
+              <w:t xml:space="preserve">Log out landed on the Administrator sign-in page; </w:t>
+            </w:r>
+            <w:r>
+              <w:rPr>
+                <w:rFonts w:ascii="Consolas" w:cs="Consolas" w:eastAsia="Consolas" w:hAnsi="Consolas"/>
+                <w:sz w:val="18"/>
+                <w:szCs w:val="18"/>
+              </w:rPr>
+              <w:t xml:space="preserve">/admin</w:t>
+            </w:r>
+            <w:r>
+              <w:rPr>
+                <w:rFonts w:ascii="Calibri" w:cs="Calibri" w:eastAsia="Calibri" w:hAnsi="Calibri"/>
+                <w:sz w:val="20"/>
+                <w:szCs w:val="20"/>
+              </w:rPr>
+              <w:t xml:space="preserve"> also opened the sign-in page (Oct 24-25)</w:t>
             </w:r>
           </w:p>
         </w:tc>
@@ -1705,7 +1721,7 @@
                 <w:sz w:val="20"/>
                 <w:szCs w:val="20"/>
               </w:rPr>
-              <w:t xml:space="preserve">As expected (Oct 25, Pauline)</w:t>
+              <w:t xml:space="preserve">R1 refused with "This account uses the mobile app" and the Get the Android app button; no dashboard (Oct 24-25)</w:t>
             </w:r>
           </w:p>
         </w:tc>
@@ -1979,11 +1995,51 @@
             </w:pPr>
             <w:r>
               <w:rPr>
-                <w:rFonts w:ascii="Calibri" w:cs="Calibri" w:eastAsia="Calibri" w:hAnsi="Calibri"/>
-                <w:sz w:val="20"/>
-                <w:szCs w:val="20"/>
-              </w:rPr>
-              <w:t xml:space="preserve">As expected (Oct 25, Pauline)</w:t>
+                <w:rFonts w:ascii="Consolas" w:cs="Consolas" w:eastAsia="Consolas" w:hAnsi="Consolas"/>
+                <w:sz w:val="18"/>
+                <w:szCs w:val="18"/>
+              </w:rPr>
+              <w:t xml:space="preserve">RW-000004</w:t>
+            </w:r>
+            <w:r>
+              <w:rPr>
+                <w:rFonts w:ascii="Calibri" w:cs="Calibri" w:eastAsia="Calibri" w:hAnsi="Calibri"/>
+                <w:sz w:val="20"/>
+                <w:szCs w:val="20"/>
+              </w:rPr>
+              <w:t xml:space="preserve">, </w:t>
+            </w:r>
+            <w:r>
+              <w:rPr>
+                <w:rFonts w:ascii="Consolas" w:cs="Consolas" w:eastAsia="Consolas" w:hAnsi="Consolas"/>
+                <w:sz w:val="18"/>
+                <w:szCs w:val="18"/>
+              </w:rPr>
+              <w:t xml:space="preserve">#4</w:t>
+            </w:r>
+            <w:r>
+              <w:rPr>
+                <w:rFonts w:ascii="Calibri" w:cs="Calibri" w:eastAsia="Calibri" w:hAnsi="Calibri"/>
+                <w:sz w:val="20"/>
+                <w:szCs w:val="20"/>
+              </w:rPr>
+              <w:t xml:space="preserve"> and </w:t>
+            </w:r>
+            <w:r>
+              <w:rPr>
+                <w:rFonts w:ascii="Consolas" w:cs="Consolas" w:eastAsia="Consolas" w:hAnsi="Consolas"/>
+                <w:sz w:val="18"/>
+                <w:szCs w:val="18"/>
+              </w:rPr>
+              <w:t xml:space="preserve">4</w:t>
+            </w:r>
+            <w:r>
+              <w:rPr>
+                <w:rFonts w:ascii="Calibri" w:cs="Calibri" w:eastAsia="Calibri" w:hAnsi="Calibri"/>
+                <w:sz w:val="20"/>
+                <w:szCs w:val="20"/>
+              </w:rPr>
+              <w:t xml:space="preserve"> each listed only RW-000004 ("1 report matches these filters"); a location word listed only the matching reports (Oct 24-25)</w:t>
             </w:r>
           </w:p>
         </w:tc>
@@ -2213,7 +2269,7 @@
                 <w:sz w:val="20"/>
                 <w:szCs w:val="20"/>
               </w:rPr>
-              <w:t xml:space="preserve">As expected (Oct 25, Pauline)</w:t>
+              <w:t xml:space="preserve">Each filter narrowed the list; combined filters worked; Clear filters showed all reports again (Oct 24-25)</w:t>
             </w:r>
           </w:p>
         </w:tc>
@@ -2461,7 +2517,7 @@
                 <w:sz w:val="20"/>
                 <w:szCs w:val="20"/>
               </w:rPr>
-              <w:t xml:space="preserve">As expected (Oct 25, Pauline)</w:t>
+              <w:t xml:space="preserve">PDF opened as a landscape table with the filters in the title, the header row on every page and "Page X of Y" (Oct 24-25)</w:t>
             </w:r>
           </w:p>
         </w:tc>
@@ -2709,7 +2765,7 @@
                 <w:sz w:val="20"/>
                 <w:szCs w:val="20"/>
               </w:rPr>
-              <w:t xml:space="preserve">As expected (Oct 25, Pauline)</w:t>
+              <w:t xml:space="preserve">Assign officer on a Submitted report was refused: "Verify the report first. You can assign an officer once it is Verified." (Oct 24-25)</w:t>
             </w:r>
           </w:p>
         </w:tc>
@@ -3269,7 +3325,7 @@
                 <w:sz w:val="20"/>
                 <w:szCs w:val="20"/>
               </w:rPr>
-              <w:t xml:space="preserve">As expected (Oct 25, Pauline)</w:t>
+              <w:t xml:space="preserve">R2 with the right password: "Account deactivated"; wrong password: "Couldn't log in"; after reactivation R2 logged in (Oct 24-25)</w:t>
             </w:r>
           </w:p>
         </w:tc>
@@ -3499,7 +3555,7 @@
                 <w:sz w:val="20"/>
                 <w:szCs w:val="20"/>
               </w:rPr>
-              <w:t xml:space="preserve">As expected (Oct 25, Pauline)</w:t>
+              <w:t xml:space="preserve">O1 could choose only In Progress, Additional Information Required and Resolved/Closed; "Update saved" toast; admin and R1 saw Resolved/Closed (Oct 24-25)</w:t>
             </w:r>
           </w:p>
         </w:tc>
@@ -3747,7 +3803,7 @@
                 <w:sz w:val="20"/>
                 <w:szCs w:val="20"/>
               </w:rPr>
-              <w:t xml:space="preserve">As expected (Oct 25, Pauline)</w:t>
+              <w:t xml:space="preserve">Rejected report not under "All open", listed under "All assigned to me"; no Update status button; the rejection note shown (Oct 24-25)</w:t>
             </w:r>
           </w:p>
         </w:tc>

</xml_diff>